<commit_message>
auto(daily): dev loop report 2026-06-09
</commit_message>
<xml_diff>
--- a/reports/hypothesis/2026-06-09.docx
+++ b/reports/hypothesis/2026-06-09.docx
@@ -15,7 +15,7 @@
         <w:rPr>
           <w:i/>
         </w:rPr>
-        <w:t>생성일: 2026-06-09 09:15 KST  |  표본: 측정소당 최소 2365건 / 총 12000건</w:t>
+        <w:t>생성일: 2026-06-09 13:22 KST  |  표본: 측정소당 최소 2369건 / 총 12020건</w:t>
       </w:r>
     </w:p>
     <w:p>
@@ -143,7 +143,7 @@
           </w:tcPr>
           <w:p>
             <w:r>
-              <w:t>37.334</w:t>
+              <w:t>37.329</w:t>
             </w:r>
           </w:p>
         </w:tc>
@@ -153,7 +153,7 @@
           </w:tcPr>
           <w:p>
             <w:r>
-              <w:t>34.209</w:t>
+              <w:t>34.202</w:t>
             </w:r>
           </w:p>
         </w:tc>
@@ -163,7 +163,7 @@
           </w:tcPr>
           <w:p>
             <w:r>
-              <w:t>+3.125</w:t>
+              <w:t>+3.128</w:t>
             </w:r>
           </w:p>
         </w:tc>
@@ -215,7 +215,7 @@
           </w:tcPr>
           <w:p>
             <w:r>
-              <w:t>20.835</w:t>
+              <w:t>20.831</w:t>
             </w:r>
           </w:p>
         </w:tc>
@@ -225,7 +225,7 @@
           </w:tcPr>
           <w:p>
             <w:r>
-              <w:t>17.669</w:t>
+              <w:t>17.677</w:t>
             </w:r>
           </w:p>
         </w:tc>
@@ -235,7 +235,7 @@
           </w:tcPr>
           <w:p>
             <w:r>
-              <w:t>+3.165</w:t>
+              <w:t>+3.155</w:t>
             </w:r>
           </w:p>
         </w:tc>
@@ -513,7 +513,7 @@
           </w:tcPr>
           <w:p>
             <w:r>
-              <w:t>0.482</w:t>
+              <w:t>0.481</w:t>
             </w:r>
           </w:p>
         </w:tc>
@@ -660,7 +660,7 @@
           </w:tcPr>
           <w:p>
             <w:r>
-              <w:t>31.82</w:t>
+              <w:t>31.94</w:t>
             </w:r>
           </w:p>
         </w:tc>
@@ -722,7 +722,7 @@
           </w:tcPr>
           <w:p>
             <w:r>
-              <w:t>78.18</w:t>
+              <w:t>78.30</w:t>
             </w:r>
           </w:p>
         </w:tc>
@@ -784,7 +784,7 @@
           </w:tcPr>
           <w:p>
             <w:r>
-              <w:t>11.41</w:t>
+              <w:t>11.23</w:t>
             </w:r>
           </w:p>
         </w:tc>
@@ -846,7 +846,7 @@
           </w:tcPr>
           <w:p>
             <w:r>
-              <w:t>150.97</w:t>
+              <w:t>151.31</w:t>
             </w:r>
           </w:p>
         </w:tc>
@@ -876,7 +876,7 @@
           </w:tcPr>
           <w:p>
             <w:r>
-              <w:t>0.049</w:t>
+              <w:t>0.050</w:t>
             </w:r>
           </w:p>
         </w:tc>
@@ -908,7 +908,7 @@
           </w:tcPr>
           <w:p>
             <w:r>
-              <w:t>71.86</w:t>
+              <w:t>71.68</w:t>
             </w:r>
           </w:p>
         </w:tc>
@@ -970,7 +970,7 @@
           </w:tcPr>
           <w:p>
             <w:r>
-              <w:t>148.81</w:t>
+              <w:t>148.55</w:t>
             </w:r>
           </w:p>
         </w:tc>
@@ -1029,7 +1029,7 @@
         <w:pStyle w:val="ListBullet"/>
       </w:pPr>
       <w:r>
-        <w:t>'산단 영향군'가 '베이스라인'보다 평균 3.17 높음 (p=0.0000, 효과크기 작음 d=0.24).</w:t>
+        <w:t>'산단 영향군'가 '베이스라인'보다 평균 3.15 높음 (p=0.0000, 효과크기 작음 d=0.24).</w:t>
       </w:r>
     </w:p>
     <w:p>

</xml_diff>